<commit_message>
Add real participant names and course to continuidad video
Team is Sofía Cabrera, Micaela Cubilla, Fabrizio Riquelme and
Jerónimo Lovera (course 3° B BATIN). Names now appear in the closing
credits of scene 6, course line added to the scene 1 intro card, and
the guion docx uses real names instead of "Participante N" placeholders.
</commit_message>
<xml_diff>
--- a/video_continuidad/Guion_Detectives_Continuidad.docx
+++ b/video_continuidad/Guion_Detectives_Continuidad.docx
@@ -21,6 +21,29 @@
           <w:sz w:val="26"/>
         </w:rPr>
         <w:t>Develando los secretos de las funciones</w:t>
+      </w:r>
+    </w:p>
+    <w:p>
+      <w:pPr>
+        <w:jc w:val="center"/>
+      </w:pPr>
+      <w:r>
+        <w:rPr>
+          <w:color w:val="606060"/>
+          <w:sz w:val="22"/>
+        </w:rPr>
+        <w:t>Matemática · 3° B BATIN</w:t>
+      </w:r>
+    </w:p>
+    <w:p>
+      <w:pPr>
+        <w:jc w:val="center"/>
+      </w:pPr>
+      <w:r>
+        <w:rPr>
+          <w:sz w:val="22"/>
+        </w:rPr>
+        <w:t>Equipo: Sofía Cabrera · Micaela Cubilla · Fabrizio Riquelme · Jerónimo Lovera</w:t>
       </w:r>
     </w:p>
     <w:p>
@@ -161,7 +184,7 @@
                 <w:b/>
                 <w:color w:val="0E7AB4"/>
               </w:rPr>
-              <w:t>Participante 1</w:t>
+              <w:t>Sofía Cabrera</w:t>
             </w:r>
           </w:p>
         </w:tc>
@@ -207,7 +230,7 @@
                 <w:b/>
                 <w:color w:val="0E7AB4"/>
               </w:rPr>
-              <w:t>Participante 1</w:t>
+              <w:t>Sofía Cabrera</w:t>
             </w:r>
           </w:p>
         </w:tc>
@@ -253,7 +276,7 @@
                 <w:b/>
                 <w:color w:val="6D28D9"/>
               </w:rPr>
-              <w:t>Participante 2</w:t>
+              <w:t>Micaela Cubilla</w:t>
             </w:r>
           </w:p>
         </w:tc>
@@ -299,7 +322,7 @@
                 <w:b/>
                 <w:color w:val="B47B0E"/>
               </w:rPr>
-              <w:t>Participante 3</w:t>
+              <w:t>Fabrizio Riquelme</w:t>
             </w:r>
           </w:p>
         </w:tc>
@@ -345,7 +368,7 @@
                 <w:b/>
                 <w:color w:val="C2410C"/>
               </w:rPr>
-              <w:t>Participante 4</w:t>
+              <w:t>Jerónimo Lovera</w:t>
             </w:r>
           </w:p>
         </w:tc>
@@ -425,7 +448,7 @@
           <w:color w:val="0E7AB4"/>
           <w:sz w:val="24"/>
         </w:rPr>
-        <w:t>Habla: Participante 1</w:t>
+        <w:t>Habla: Sofía Cabrera</w:t>
       </w:r>
     </w:p>
     <w:p>
@@ -456,7 +479,7 @@
           <w:color w:val="0E7AB4"/>
           <w:sz w:val="24"/>
         </w:rPr>
-        <w:t>Habla: Participante 1</w:t>
+        <w:t>Habla: Sofía Cabrera</w:t>
       </w:r>
     </w:p>
     <w:p>
@@ -571,7 +594,7 @@
           <w:color w:val="6D28D9"/>
           <w:sz w:val="24"/>
         </w:rPr>
-        <w:t>Habla: Participante 2</w:t>
+        <w:t>Habla: Micaela Cubilla</w:t>
       </w:r>
     </w:p>
     <w:p>
@@ -722,7 +745,7 @@
           <w:color w:val="B47B0E"/>
           <w:sz w:val="24"/>
         </w:rPr>
-        <w:t>Habla: Participante 3</w:t>
+        <w:t>Habla: Fabrizio Riquelme</w:t>
       </w:r>
     </w:p>
     <w:p>
@@ -837,7 +860,7 @@
           <w:color w:val="C2410C"/>
           <w:sz w:val="24"/>
         </w:rPr>
-        <w:t>Habla: Participante 4</w:t>
+        <w:t>Habla: Jerónimo Lovera</w:t>
       </w:r>
     </w:p>
     <w:p>
@@ -991,7 +1014,7 @@
           <w:color w:val="0E7AB4"/>
           <w:sz w:val="24"/>
         </w:rPr>
-        <w:t xml:space="preserve">Participante 1: </w:t>
+        <w:t xml:space="preserve">Sofía Cabrera: </w:t>
       </w:r>
       <w:r>
         <w:rPr>
@@ -1011,7 +1034,7 @@
           <w:color w:val="6D28D9"/>
           <w:sz w:val="24"/>
         </w:rPr>
-        <w:t xml:space="preserve">Participante 2: </w:t>
+        <w:t xml:space="preserve">Micaela Cubilla: </w:t>
       </w:r>
       <w:r>
         <w:rPr>
@@ -1031,7 +1054,7 @@
           <w:color w:val="B47B0E"/>
           <w:sz w:val="24"/>
         </w:rPr>
-        <w:t xml:space="preserve">Participante 3: </w:t>
+        <w:t xml:space="preserve">Fabrizio Riquelme: </w:t>
       </w:r>
       <w:r>
         <w:rPr>
@@ -1051,7 +1074,7 @@
           <w:color w:val="C2410C"/>
           <w:sz w:val="24"/>
         </w:rPr>
-        <w:t xml:space="preserve">Participante 4: </w:t>
+        <w:t xml:space="preserve">Jerónimo Lovera: </w:t>
       </w:r>
       <w:r>
         <w:rPr>
@@ -1071,7 +1094,7 @@
           <w:color w:val="0E7AB4"/>
           <w:sz w:val="24"/>
         </w:rPr>
-        <w:t xml:space="preserve">Todos / Participante 1: </w:t>
+        <w:t xml:space="preserve">Todos / Sofía Cabrera: </w:t>
       </w:r>
       <w:r>
         <w:rPr>
@@ -1095,7 +1118,7 @@
         <w:rPr>
           <w:i/>
         </w:rPr>
-        <w:t>Dejar un espacio en pantalla al final de la Escena 6 (o como escena adicional de créditos) con los nombres reales de los cuatro integrantes del equipo.</w:t>
+        <w:t>Los nombres de los cuatro integrantes ya aparecen en pantalla al final de la Escena 6, debajo del mensaje de cierre.</w:t>
       </w:r>
     </w:p>
     <w:sectPr>

</xml_diff>